<commit_message>
All docs: Seymur & Rahman as co-founders (md, tex+pdf, docx, handoff package)
</commit_message>
<xml_diff>
--- a/docs/niw/Forkcast_Reference_Letter_Briefing.docx
+++ b/docs/niw/Forkcast_Reference_Letter_Briefing.docx
@@ -27,7 +27,7 @@
           <w:color w:val="605D5D"/>
           <w:sz w:val="19"/>
         </w:rPr>
-        <w:t>Prepared July 2026 · In support of the founder's EB-2 National Interest Waiver petition · seymurhh.github.io/forkcast-live</w:t>
+        <w:t>Prepared July 2026 · In support of co-founder Seymur Hasanov's EB-2 National Interest Waiver petition · seymurhh.github.io/forkcast-live</w:t>
       </w:r>
     </w:p>
     <w:p>
@@ -334,7 +334,7 @@
           <w:color w:val="201E1D"/>
           <w:sz w:val="21"/>
         </w:rPr>
-        <w:t>Whatever falls within your own expertise and experience, for example: the significance of the public-health problem and of intervening at the point of ordering; the value of verified nutrition data for independent restaurants and their customers; the technical soundness or novelty of the approach (AI estimation with disclosed uncertainty, adaptive calibration, evidence-first measurement); the founder's capability as demonstrated by the working product; or the economic and small-business dimensions described above. Letters should be on letterhead where possible, state your credentials and relationship to the project (including if you have none beyond reviewing it), and be entirely in your own words.</w:t>
+        <w:t>Whatever falls within your own expertise and experience, for example: the significance of the public-health problem and of intervening at the point of ordering; the value of verified nutrition data for independent restaurants and their customers; the technical soundness or novelty of the approach (AI estimation with disclosed uncertainty, adaptive calibration, evidence-first measurement); the founders' capability as demonstrated by the working product; or the economic and small-business dimensions described above. Letters should be on letterhead where possible, state your credentials and relationship to the project (including if you have none beyond reviewing it), and be entirely in your own words.</w:t>
       </w:r>
     </w:p>
     <w:p>
@@ -383,11 +383,9 @@
         <w:rPr>
           <w:b/>
         </w:rPr>
-        <w:t xml:space="preserve">Founder: </w:t>
+        <w:t>Co-founders: Seymur Hasanov &amp; Rahman · Contact: Seymur Hasanov · shasanov@seas.harvard.edu</w:t>
       </w:r>
-      <w:r>
-        <w:t>Seymur Hasanov · shasanov@seas.harvard.edu</w:t>
-      </w:r>
+      <w:r/>
     </w:p>
     <w:p>
       <w:r>

</xml_diff>